<commit_message>
fix: force overwrite word template files on disk with new A4 layout layout tables
</commit_message>
<xml_diff>
--- a/data/template_nghidinh30.docx
+++ b/data/template_nghidinh30.docx
@@ -2,18 +2,68 @@
 <file path=word/document.xml><?xml version="1.0" encoding="utf-8"?>
 <w:document xmlns:wpc="http://schemas.microsoft.com/office/word/2010/wordprocessingCanvas" xmlns:mo="http://schemas.microsoft.com/office/mac/office/2008/main" xmlns:mc="http://schemas.openxmlformats.org/markup-compatibility/2006" xmlns:mv="urn:schemas-microsoft-com:mac:vml" xmlns:o="urn:schemas-microsoft-com:office:office" xmlns:r="http://schemas.openxmlformats.org/officeDocument/2006/relationships" xmlns:m="http://schemas.openxmlformats.org/officeDocument/2006/math" xmlns:v="urn:schemas-microsoft-com:vml" xmlns:wp14="http://schemas.microsoft.com/office/word/2010/wordprocessingDrawing" xmlns:wp="http://schemas.openxmlformats.org/drawingml/2006/wordprocessingDrawing" xmlns:w10="urn:schemas-microsoft-com:office:word" xmlns:w="http://schemas.openxmlformats.org/wordprocessingml/2006/main" xmlns:w14="http://schemas.microsoft.com/office/word/2010/wordml" xmlns:wpg="http://schemas.microsoft.com/office/word/2010/wordprocessingGroup" xmlns:wpi="http://schemas.microsoft.com/office/word/2010/wordprocessingInk" xmlns:wne="http://schemas.microsoft.com/office/word/2006/wordml" xmlns:wps="http://schemas.microsoft.com/office/word/2010/wordprocessingShape" mc:Ignorable="w14 wp14">
   <w:body>
-    <w:p>
-      <w:r>
-        <w:t>{{ co_quan }}</w:t>
-      </w:r>
-    </w:p>
-    <w:p>
-      <w:r>
-        <w:t>Số: {{ so_ky_hieu }}</w:t>
-      </w:r>
-    </w:p>
+    <w:tbl>
+      <w:tblPr>
+        <w:tblW w:type="auto" w:w="0"/>
+        <w:tblLayout w:type="autofit"/>
+        <w:tblLook w:firstColumn="1" w:firstRow="1" w:lastColumn="0" w:lastRow="0" w:noHBand="0" w:noVBand="1" w:val="04A0"/>
+      </w:tblPr>
+      <w:tblGrid>
+        <w:gridCol w:w="4320"/>
+        <w:gridCol w:w="4320"/>
+      </w:tblGrid>
+      <w:tr>
+        <w:tc>
+          <w:tcPr>
+            <w:tcW w:type="dxa" w:w="4320"/>
+          </w:tcPr>
+          <w:p>
+            <w:pPr>
+              <w:jc w:val="center"/>
+            </w:pPr>
+            <w:r>
+              <w:t>{{ co_quan }}</w:t>
+              <w:br/>
+              <w:t>-------------------</w:t>
+              <w:br/>
+              <w:t>Số: {{ so_ky_hieu }}</w:t>
+            </w:r>
+          </w:p>
+        </w:tc>
+        <w:tc>
+          <w:tcPr>
+            <w:tcW w:type="dxa" w:w="4320"/>
+          </w:tcPr>
+          <w:p>
+            <w:pPr>
+              <w:jc w:val="center"/>
+            </w:pPr>
+            <w:r>
+              <w:t>CỘNG HÒA XÃ HỘI CHỦ NGHĨA VIỆT NAM</w:t>
+              <w:br/>
+              <w:t>Độc lập - Tự do - Hạnh phúc</w:t>
+              <w:br/>
+              <w:t>-----------------------</w:t>
+              <w:br/>
+              <w:t>{{ dia_danh }}, ngày {{ ngay }} tháng {{ thang }} năm {{ nam }}</w:t>
+            </w:r>
+          </w:p>
+        </w:tc>
+      </w:tr>
+    </w:tbl>
     <w:p/>
     <w:p>
+      <w:pPr>
+        <w:jc w:val="center"/>
+      </w:pPr>
+      <w:r>
+        <w:rPr>
+          <w:b/>
+          <w:sz w:val="28"/>
+        </w:rPr>
+        <w:t>{{ loai_van_ban }}</w:t>
+        <w:br/>
+      </w:r>
       <w:r>
         <w:rPr>
           <w:b/>
@@ -28,11 +78,52 @@
       </w:r>
     </w:p>
     <w:p/>
-    <w:p>
-      <w:r>
-        <w:t>Người ký: {{ nguoi_ky }}</w:t>
-      </w:r>
-    </w:p>
+    <w:tbl>
+      <w:tblPr>
+        <w:tblW w:type="auto" w:w="0"/>
+        <w:tblLook w:firstColumn="1" w:firstRow="1" w:lastColumn="0" w:lastRow="0" w:noHBand="0" w:noVBand="1" w:val="04A0"/>
+      </w:tblPr>
+      <w:tblGrid>
+        <w:gridCol w:w="4320"/>
+        <w:gridCol w:w="4320"/>
+      </w:tblGrid>
+      <w:tr>
+        <w:tc>
+          <w:tcPr>
+            <w:tcW w:type="dxa" w:w="4320"/>
+          </w:tcPr>
+          <w:p>
+            <w:r>
+              <w:t>Nơi nhận:</w:t>
+              <w:br/>
+              <w:t>- Như trên;</w:t>
+              <w:br/>
+              <w:t>- Lưu: {{ noi_luu }}.</w:t>
+            </w:r>
+          </w:p>
+        </w:tc>
+        <w:tc>
+          <w:tcPr>
+            <w:tcW w:type="dxa" w:w="4320"/>
+          </w:tcPr>
+          <w:p>
+            <w:pPr>
+              <w:jc w:val="center"/>
+            </w:pPr>
+            <w:r>
+              <w:rPr>
+                <w:b/>
+              </w:rPr>
+              <w:t>{{ chuc_vu_nguoi_ky }}</w:t>
+              <w:br/>
+              <w:br/>
+              <w:br/>
+              <w:t>{{ nguoi_ky }}</w:t>
+            </w:r>
+          </w:p>
+        </w:tc>
+      </w:tr>
+    </w:tbl>
     <w:sectPr>
       <w:pgSz w:w="12240" w:h="15840"/>
       <w:pgMar w:top="1440" w:right="1800" w:bottom="1440" w:left="1800" w:header="720" w:footer="720" w:gutter="0"/>

</xml_diff>